<commit_message>
Use Case 1 Automation testing completed
</commit_message>
<xml_diff>
--- a/Report/Iteration_1/BIT216-Assignment2-Iteration-1(Test_plan_and_Documentation).docx
+++ b/Report/Iteration_1/BIT216-Assignment2-Iteration-1(Test_plan_and_Documentation).docx
@@ -9,6 +9,12 @@
           <w:color w:val="000000" w:themeColor="text1"/>
         </w:rPr>
       </w:pPr>
+      <w:r>
+        <w:rPr>
+          <w:color w:val="000000" w:themeColor="text1"/>
+        </w:rPr>
+        <w:t>1</w:t>
+      </w:r>
     </w:p>
     <w:p>
       <w:pPr>
@@ -34,6 +40,7 @@
           <w:color w:val="000000" w:themeColor="text1"/>
         </w:rPr>
       </w:pPr>
+      <w:proofErr w:type="spellStart"/>
       <w:r>
         <w:rPr>
           <w:rFonts w:cs="Calibri"/>
@@ -45,6 +52,7 @@
         </w:rPr>
         <w:t>ZeroWaste</w:t>
       </w:r>
+      <w:proofErr w:type="spellEnd"/>
     </w:p>
     <w:p>
       <w:pPr>
@@ -293,6 +301,7 @@
                 <w:color w:val="000000" w:themeColor="text1"/>
               </w:rPr>
             </w:pPr>
+            <w:proofErr w:type="spellStart"/>
             <w:r>
               <w:rPr>
                 <w:rFonts w:cs="Calibri"/>
@@ -300,6 +309,7 @@
               </w:rPr>
               <w:t>ZeroWaste</w:t>
             </w:r>
+            <w:proofErr w:type="spellEnd"/>
           </w:p>
         </w:tc>
       </w:tr>
@@ -595,7 +605,23 @@
           <w:rFonts w:cs="Calibri"/>
           <w:color w:val="000000" w:themeColor="text1"/>
         </w:rPr>
-        <w:t>This document outlines the test strategy (what, when, and who) and the executable test cases (how) for all six use cases of the SavePlate Smart Food Waste Reduction App. It is aligned with the Iteration 1 assessment requirements.</w:t>
+        <w:t xml:space="preserve">This document outlines the test strategy (what, when, and who) and the executable test cases (how) for all six use cases of the </w:t>
+      </w:r>
+      <w:proofErr w:type="spellStart"/>
+      <w:r>
+        <w:rPr>
+          <w:rFonts w:cs="Calibri"/>
+          <w:color w:val="000000" w:themeColor="text1"/>
+        </w:rPr>
+        <w:t>SavePlate</w:t>
+      </w:r>
+      <w:proofErr w:type="spellEnd"/>
+      <w:r>
+        <w:rPr>
+          <w:rFonts w:cs="Calibri"/>
+          <w:color w:val="000000" w:themeColor="text1"/>
+        </w:rPr>
+        <w:t xml:space="preserve"> Smart Food Waste Reduction App. It is aligned with the Iteration 1 assessment requirements.</w:t>
       </w:r>
     </w:p>
     <w:p>
@@ -7773,7 +7799,23 @@
                 <w:rFonts w:cs="Calibri"/>
                 <w:color w:val="000000" w:themeColor="text1"/>
               </w:rPr>
-              <w:t>Form submit handler / database insert (POST /inventory)</w:t>
+              <w:t xml:space="preserve">Form </w:t>
+            </w:r>
+            <w:proofErr w:type="gramStart"/>
+            <w:r>
+              <w:rPr>
+                <w:rFonts w:cs="Calibri"/>
+                <w:color w:val="000000" w:themeColor="text1"/>
+              </w:rPr>
+              <w:t>submit</w:t>
+            </w:r>
+            <w:proofErr w:type="gramEnd"/>
+            <w:r>
+              <w:rPr>
+                <w:rFonts w:cs="Calibri"/>
+                <w:color w:val="000000" w:themeColor="text1"/>
+              </w:rPr>
+              <w:t xml:space="preserve"> handler / database insert (POST /inventory)</w:t>
             </w:r>
           </w:p>
         </w:tc>
@@ -9984,7 +10026,23 @@
                 <w:rFonts w:cs="Calibri"/>
                 <w:color w:val="000000" w:themeColor="text1"/>
               </w:rPr>
-              <w:t>Item Name: Eggs Quantity: 'abc' Expiry: 2025-09-15 Category: Dairy</w:t>
+              <w:t>Item Name: Eggs Quantity: '</w:t>
+            </w:r>
+            <w:proofErr w:type="spellStart"/>
+            <w:r>
+              <w:rPr>
+                <w:rFonts w:cs="Calibri"/>
+                <w:color w:val="000000" w:themeColor="text1"/>
+              </w:rPr>
+              <w:t>abc</w:t>
+            </w:r>
+            <w:proofErr w:type="spellEnd"/>
+            <w:r>
+              <w:rPr>
+                <w:rFonts w:cs="Calibri"/>
+                <w:color w:val="000000" w:themeColor="text1"/>
+              </w:rPr>
+              <w:t>' Expiry: 2025-09-15 Category: Dairy</w:t>
             </w:r>
           </w:p>
         </w:tc>
@@ -10901,8 +10959,17 @@
                 <w:rFonts w:cs="Calibri"/>
                 <w:color w:val="000000" w:themeColor="text1"/>
               </w:rPr>
-              <w:t>Saksham Sharma Sedhai</w:t>
-            </w:r>
+              <w:t xml:space="preserve">Saksham Sharma </w:t>
+            </w:r>
+            <w:proofErr w:type="spellStart"/>
+            <w:r>
+              <w:rPr>
+                <w:rFonts w:cs="Calibri"/>
+                <w:color w:val="000000" w:themeColor="text1"/>
+              </w:rPr>
+              <w:t>Sedhai</w:t>
+            </w:r>
+            <w:proofErr w:type="spellEnd"/>
           </w:p>
         </w:tc>
       </w:tr>

</xml_diff>

<commit_message>
minor changes on the UI for iteration 1 and in the send mail also
</commit_message>
<xml_diff>
--- a/Report/Iteration_1/BIT216-Assignment2-Iteration-1(Test_plan_and_Documentation).docx
+++ b/Report/Iteration_1/BIT216-Assignment2-Iteration-1(Test_plan_and_Documentation).docx
@@ -1,6 +1,6 @@
 
 <file path=word/document.xml><?xml version="1.0" encoding="utf-8"?>
-<w:document xmlns:wpc="http://schemas.microsoft.com/office/word/2010/wordprocessingCanvas" xmlns:cx="http://schemas.microsoft.com/office/drawing/2014/chartex" xmlns:cx1="http://schemas.microsoft.com/office/drawing/2015/9/8/chartex" xmlns:cx2="http://schemas.microsoft.com/office/drawing/2015/10/21/chartex" xmlns:cx3="http://schemas.microsoft.com/office/drawing/2016/5/9/chartex" xmlns:cx4="http://schemas.microsoft.com/office/drawing/2016/5/10/chartex" xmlns:cx5="http://schemas.microsoft.com/office/drawing/2016/5/11/chartex" xmlns:cx6="http://schemas.microsoft.com/office/drawing/2016/5/12/chartex" xmlns:cx7="http://schemas.microsoft.com/office/drawing/2016/5/13/chartex" xmlns:cx8="http://schemas.microsoft.com/office/drawing/2016/5/14/chartex" xmlns:mc="http://schemas.openxmlformats.org/markup-compatibility/2006" xmlns:aink="http://schemas.microsoft.com/office/drawing/2016/ink" xmlns:am3d="http://schemas.microsoft.com/office/drawing/2017/model3d" xmlns:o="urn:schemas-microsoft-com:office:office" xmlns:oel="http://schemas.microsoft.com/office/2019/extlst" xmlns:r="http://schemas.openxmlformats.org/officeDocument/2006/relationships" xmlns:m="http://schemas.openxmlformats.org/officeDocument/2006/math" xmlns:v="urn:schemas-microsoft-com:vml" xmlns:wp14="http://schemas.microsoft.com/office/word/2010/wordprocessingDrawing" xmlns:wp="http://schemas.openxmlformats.org/drawingml/2006/wordprocessingDrawing" xmlns:w10="urn:schemas-microsoft-com:office:word" xmlns:w="http://schemas.openxmlformats.org/wordprocessingml/2006/main" xmlns:w14="http://schemas.microsoft.com/office/word/2010/wordml" xmlns:w15="http://schemas.microsoft.com/office/word/2012/wordml" xmlns:w16cex="http://schemas.microsoft.com/office/word/2018/wordml/cex" xmlns:w16cid="http://schemas.microsoft.com/office/word/2016/wordml/cid" xmlns:w16="http://schemas.microsoft.com/office/word/2018/wordml" xmlns:w16du="http://schemas.microsoft.com/office/word/2023/wordml/word16du" xmlns:w16sdtdh="http://schemas.microsoft.com/office/word/2020/wordml/sdtdatahash" xmlns:w16se="http://schemas.microsoft.com/office/word/2015/wordml/symex" xmlns:wpg="http://schemas.microsoft.com/office/word/2010/wordprocessingGroup" xmlns:wpi="http://schemas.microsoft.com/office/word/2010/wordprocessingInk" xmlns:wne="http://schemas.microsoft.com/office/word/2006/wordml" xmlns:wps="http://schemas.microsoft.com/office/word/2010/wordprocessingShape" mc:Ignorable="w14 w15 w16se w16cid w16 w16cex w16sdtdh wp14">
+<w:document xmlns:wpc="http://schemas.microsoft.com/office/word/2010/wordprocessingCanvas" xmlns:cx="http://schemas.microsoft.com/office/drawing/2014/chartex" xmlns:cx1="http://schemas.microsoft.com/office/drawing/2015/9/8/chartex" xmlns:cx2="http://schemas.microsoft.com/office/drawing/2015/10/21/chartex" xmlns:cx3="http://schemas.microsoft.com/office/drawing/2016/5/9/chartex" xmlns:cx4="http://schemas.microsoft.com/office/drawing/2016/5/10/chartex" xmlns:cx5="http://schemas.microsoft.com/office/drawing/2016/5/11/chartex" xmlns:cx6="http://schemas.microsoft.com/office/drawing/2016/5/12/chartex" xmlns:cx7="http://schemas.microsoft.com/office/drawing/2016/5/13/chartex" xmlns:cx8="http://schemas.microsoft.com/office/drawing/2016/5/14/chartex" xmlns:mc="http://schemas.openxmlformats.org/markup-compatibility/2006" xmlns:aink="http://schemas.microsoft.com/office/drawing/2016/ink" xmlns:am3d="http://schemas.microsoft.com/office/drawing/2017/model3d" xmlns:o="urn:schemas-microsoft-com:office:office" xmlns:oel="http://schemas.microsoft.com/office/2019/extlst" xmlns:r="http://schemas.openxmlformats.org/officeDocument/2006/relationships" xmlns:m="http://schemas.openxmlformats.org/officeDocument/2006/math" xmlns:v="urn:schemas-microsoft-com:vml" xmlns:wp14="http://schemas.microsoft.com/office/word/2010/wordprocessingDrawing" xmlns:wp="http://schemas.openxmlformats.org/drawingml/2006/wordprocessingDrawing" xmlns:w10="urn:schemas-microsoft-com:office:word" xmlns:w="http://schemas.openxmlformats.org/wordprocessingml/2006/main" xmlns:w14="http://schemas.microsoft.com/office/word/2010/wordml" xmlns:w15="http://schemas.microsoft.com/office/word/2012/wordml" xmlns:w16cex="http://schemas.microsoft.com/office/word/2018/wordml/cex" xmlns:w16cid="http://schemas.microsoft.com/office/word/2016/wordml/cid" xmlns:w16="http://schemas.microsoft.com/office/word/2018/wordml" xmlns:w16du="http://schemas.microsoft.com/office/word/2023/wordml/word16du" xmlns:w16sdtdh="http://schemas.microsoft.com/office/word/2020/wordml/sdtdatahash" xmlns:w16sdtfl="http://schemas.microsoft.com/office/word/2024/wordml/sdtformatlock" xmlns:w16se="http://schemas.microsoft.com/office/word/2015/wordml/symex" xmlns:wpg="http://schemas.microsoft.com/office/word/2010/wordprocessingGroup" xmlns:wpi="http://schemas.microsoft.com/office/word/2010/wordprocessingInk" xmlns:wne="http://schemas.microsoft.com/office/word/2006/wordml" xmlns:wps="http://schemas.microsoft.com/office/word/2010/wordprocessingShape" mc:Ignorable="w14 w15 w16se w16cid w16 w16cex w16sdtdh w16sdtfl w16du wp14">
   <w:body>
     <w:p>
       <w:pPr>
@@ -34,6 +34,7 @@
           <w:color w:val="000000" w:themeColor="text1"/>
         </w:rPr>
       </w:pPr>
+      <w:proofErr w:type="spellStart"/>
       <w:r>
         <w:rPr>
           <w:rFonts w:cs="Calibri"/>
@@ -45,6 +46,7 @@
         </w:rPr>
         <w:t>ZeroWaste</w:t>
       </w:r>
+      <w:proofErr w:type="spellEnd"/>
     </w:p>
     <w:p>
       <w:pPr>
@@ -293,6 +295,7 @@
                 <w:color w:val="000000" w:themeColor="text1"/>
               </w:rPr>
             </w:pPr>
+            <w:proofErr w:type="spellStart"/>
             <w:r>
               <w:rPr>
                 <w:rFonts w:cs="Calibri"/>
@@ -300,6 +303,7 @@
               </w:rPr>
               <w:t>ZeroWaste</w:t>
             </w:r>
+            <w:proofErr w:type="spellEnd"/>
           </w:p>
         </w:tc>
       </w:tr>
@@ -595,7 +599,23 @@
           <w:rFonts w:cs="Calibri"/>
           <w:color w:val="000000" w:themeColor="text1"/>
         </w:rPr>
-        <w:t>This document outlines the test strategy (what, when, and who) and the executable test cases (how) for all six use cases of the SavePlate Smart Food Waste Reduction App. It is aligned with the Iteration 1 assessment requirements.</w:t>
+        <w:t xml:space="preserve">This document outlines the test strategy (what, when, and who) and the executable test cases (how) for all six use cases of the </w:t>
+      </w:r>
+      <w:proofErr w:type="spellStart"/>
+      <w:r>
+        <w:rPr>
+          <w:rFonts w:cs="Calibri"/>
+          <w:color w:val="000000" w:themeColor="text1"/>
+        </w:rPr>
+        <w:t>SavePlate</w:t>
+      </w:r>
+      <w:proofErr w:type="spellEnd"/>
+      <w:r>
+        <w:rPr>
+          <w:rFonts w:cs="Calibri"/>
+          <w:color w:val="000000" w:themeColor="text1"/>
+        </w:rPr>
+        <w:t xml:space="preserve"> Smart Food Waste Reduction App. It is aligned with the Iteration 1 assessment requirements.</w:t>
       </w:r>
     </w:p>
     <w:p>
@@ -3433,8 +3453,17 @@
                 <w:rFonts w:cs="Calibri"/>
                 <w:color w:val="000000" w:themeColor="text1"/>
               </w:rPr>
-              <w:t>Kabir RajBhandari</w:t>
-            </w:r>
+              <w:t xml:space="preserve">Kabir </w:t>
+            </w:r>
+            <w:proofErr w:type="spellStart"/>
+            <w:r>
+              <w:rPr>
+                <w:rFonts w:cs="Calibri"/>
+                <w:color w:val="000000" w:themeColor="text1"/>
+              </w:rPr>
+              <w:t>RajBhandari</w:t>
+            </w:r>
+            <w:proofErr w:type="spellEnd"/>
           </w:p>
         </w:tc>
       </w:tr>
@@ -9984,7 +10013,23 @@
                 <w:rFonts w:cs="Calibri"/>
                 <w:color w:val="000000" w:themeColor="text1"/>
               </w:rPr>
-              <w:t>Item Name: Eggs Quantity: 'abc' Expiry: 2025-09-15 Category: Dairy</w:t>
+              <w:t>Item Name: Eggs Quantity: '</w:t>
+            </w:r>
+            <w:proofErr w:type="spellStart"/>
+            <w:r>
+              <w:rPr>
+                <w:rFonts w:cs="Calibri"/>
+                <w:color w:val="000000" w:themeColor="text1"/>
+              </w:rPr>
+              <w:t>abc</w:t>
+            </w:r>
+            <w:proofErr w:type="spellEnd"/>
+            <w:r>
+              <w:rPr>
+                <w:rFonts w:cs="Calibri"/>
+                <w:color w:val="000000" w:themeColor="text1"/>
+              </w:rPr>
+              <w:t>' Expiry: 2025-09-15 Category: Dairy</w:t>
             </w:r>
           </w:p>
         </w:tc>
@@ -10901,8 +10946,17 @@
                 <w:rFonts w:cs="Calibri"/>
                 <w:color w:val="000000" w:themeColor="text1"/>
               </w:rPr>
-              <w:t>Saksham Sharma Sedhai</w:t>
-            </w:r>
+              <w:t xml:space="preserve">Saksham Sharma </w:t>
+            </w:r>
+            <w:proofErr w:type="spellStart"/>
+            <w:r>
+              <w:rPr>
+                <w:rFonts w:cs="Calibri"/>
+                <w:color w:val="000000" w:themeColor="text1"/>
+              </w:rPr>
+              <w:t>Sedhai</w:t>
+            </w:r>
+            <w:proofErr w:type="spellEnd"/>
           </w:p>
         </w:tc>
       </w:tr>
@@ -14085,46 +14139,26 @@
     </w:p>
     <w:p>
       <w:pPr>
-        <w:spacing w:before="40" w:after="40"/>
-        <w:rPr>
-          <w:color w:val="000000" w:themeColor="text1"/>
-        </w:rPr>
-      </w:pPr>
-    </w:p>
-    <w:p>
-      <w:pPr>
         <w:rPr>
           <w:color w:val="000000" w:themeColor="text1"/>
         </w:rPr>
       </w:pPr>
       <w:r>
         <w:rPr>
-          <w:color w:val="000000" w:themeColor="text1"/>
-        </w:rPr>
-        <w:br w:type="page"/>
-      </w:r>
-    </w:p>
-    <w:p>
-      <w:pPr>
-        <w:pStyle w:val="Heading1"/>
-        <w:pBdr>
-          <w:bottom w:val="single" w:sz="6" w:space="0" w:color="1F3864"/>
-        </w:pBdr>
-        <w:spacing w:before="400" w:after="100"/>
-        <w:rPr>
-          <w:rFonts w:eastAsia="Calibri"/>
-          <w:color w:val="000000" w:themeColor="text1"/>
-        </w:rPr>
-      </w:pPr>
-      <w:r>
-        <w:rPr>
-          <w:rFonts w:eastAsia="Calibri"/>
           <w:b/>
           <w:bCs/>
           <w:color w:val="000000" w:themeColor="text1"/>
         </w:rPr>
         <w:lastRenderedPageBreak/>
-        <w:t>8.0  TEST SUMMARY</w:t>
+        <w:t>8.0 TEST</w:t>
+      </w:r>
+      <w:r>
+        <w:rPr>
+          <w:b/>
+          <w:bCs/>
+          <w:color w:val="000000" w:themeColor="text1"/>
+        </w:rPr>
+        <w:t xml:space="preserve"> SUMMARY</w:t>
       </w:r>
     </w:p>
     <w:p>
@@ -16336,7 +16370,7 @@
 </file>
 
 <file path=word/styles.xml><?xml version="1.0" encoding="utf-8"?>
-<w:styles xmlns:mc="http://schemas.openxmlformats.org/markup-compatibility/2006" xmlns:r="http://schemas.openxmlformats.org/officeDocument/2006/relationships" xmlns:w="http://schemas.openxmlformats.org/wordprocessingml/2006/main" xmlns:w14="http://schemas.microsoft.com/office/word/2010/wordml" xmlns:w15="http://schemas.microsoft.com/office/word/2012/wordml" xmlns:w16cex="http://schemas.microsoft.com/office/word/2018/wordml/cex" xmlns:w16cid="http://schemas.microsoft.com/office/word/2016/wordml/cid" xmlns:w16="http://schemas.microsoft.com/office/word/2018/wordml" xmlns:w16sdtdh="http://schemas.microsoft.com/office/word/2020/wordml/sdtdatahash" xmlns:w16se="http://schemas.microsoft.com/office/word/2015/wordml/symex" mc:Ignorable="w14 w15 w16se w16cid w16 w16cex w16sdtdh">
+<w:styles xmlns:mc="http://schemas.openxmlformats.org/markup-compatibility/2006" xmlns:r="http://schemas.openxmlformats.org/officeDocument/2006/relationships" xmlns:w="http://schemas.openxmlformats.org/wordprocessingml/2006/main" xmlns:w14="http://schemas.microsoft.com/office/word/2010/wordml" xmlns:w15="http://schemas.microsoft.com/office/word/2012/wordml" xmlns:w16cex="http://schemas.microsoft.com/office/word/2018/wordml/cex" xmlns:w16cid="http://schemas.microsoft.com/office/word/2016/wordml/cid" xmlns:w16="http://schemas.microsoft.com/office/word/2018/wordml" xmlns:w16du="http://schemas.microsoft.com/office/word/2023/wordml/word16du" xmlns:w16sdtdh="http://schemas.microsoft.com/office/word/2020/wordml/sdtdatahash" xmlns:w16sdtfl="http://schemas.microsoft.com/office/word/2024/wordml/sdtformatlock" xmlns:w16se="http://schemas.microsoft.com/office/word/2015/wordml/symex" mc:Ignorable="w14 w15 w16se w16cid w16 w16cex w16sdtdh w16sdtfl w16du">
   <w:docDefaults>
     <w:rPrDefault>
       <w:rPr>

</xml_diff>